<commit_message>
ficed bug of vector db and twiked the model to answer if its out of the context question
</commit_message>
<xml_diff>
--- a/youtube_notes.docx
+++ b/youtube_notes.docx
@@ -12,73 +12,79 @@
     </w:p>
     <w:p>
       <w:r>
-        <w:t>**Introduction to Python Programming**</w:t>
+        <w:t>**Introduction to Java Programming**</w:t>
         <w:br/>
         <w:br/>
-        <w:t>## Introduction</w:t>
+        <w:t>### Introduction</w:t>
         <w:br/>
         <w:br/>
-        <w:t>This study guide provides an introduction to the basics of Python programming, covering key concepts such as data types, variables, loops, functions, and error handling. The guide is based on a video tutorial that uses PyCharm as the code editor and focuses on Python 3.8.</w:t>
+        <w:t>Welcome to this introduction to Java programming. This study guide is based on a 13-minute tutorial video that aims to help viewers learn the basics of Java programming. The speaker, Alex, has 8 years of experience in Java programming and a computer science degree. Alex shares their personal struggle with learning to program and wants to make it easier for others. The goal of this study guide is to provide a foundation for learning Java programming.</w:t>
         <w:br/>
         <w:br/>
-        <w:t>## Key Concepts</w:t>
+        <w:t>### Key Concepts</w:t>
         <w:br/>
         <w:br/>
-        <w:t>* **Variables**: Assigning values to variables, using underscores to separate words, and understanding case sensitivity.</w:t>
+        <w:t>* Java programming basics</w:t>
         <w:br/>
-        <w:t>* **Data Types**: Introduction to integers, strings, booleans, and lists.</w:t>
+        <w:t>* Data storage using variables</w:t>
         <w:br/>
-        <w:t>* **Loops**: For loops and while loops, including their uses and examples.</w:t>
+        <w:t>* Object-oriented programming (OOP) concepts</w:t>
         <w:br/>
-        <w:t>* **Functions**: Creating reusable code blocks using the "def" keyword.</w:t>
+        <w:t>* Control structures (if-else statements, loops, while loops)</w:t>
         <w:br/>
-        <w:t>* **Error Handling**: Using "try" and "except" blocks to handle user input and prevent program crashes.</w:t>
+        <w:t>* Methods and classes</w:t>
+        <w:br/>
+        <w:t>* APIs and exception handling</w:t>
         <w:br/>
         <w:br/>
-        <w:t>## Important Points</w:t>
+        <w:t>### Important Points</w:t>
         <w:br/>
         <w:br/>
-        <w:t>1. **Assigning Values to Variables**: Variables are case-sensitive, and the naming convention uses underscores to separate words.</w:t>
+        <w:t>1. **Programming Environment**: A programming environment, such as Eclipse or IntelliJ, is necessary to write and compile Java code.</w:t>
         <w:br/>
-        <w:t>2. **Data Types**: Understanding the different data types, including integers, strings, booleans, and lists, and how to convert between them.</w:t>
+        <w:t>2. **Variables**: Java has primitive types (int, char, long, double) and non-primitive types (String) to store data.</w:t>
         <w:br/>
-        <w:t>3. **Loops**: For loops and while loops are used to repeat tasks, and the "range" function creates a range object with values from 0 to the specified number.</w:t>
+        <w:t>3. **Semicolons**: Semicolons are used to help Java parse code and make sense of it.</w:t>
         <w:br/>
-        <w:t>4. **Functions**: Functions are created using the "def" keyword and can be named as desired, allowing for reusable code blocks.</w:t>
+        <w:t>4. **Methods**: Methods can perform tasks for the user, and anything with parentheses is likely a method.</w:t>
         <w:br/>
-        <w:t>5. **Error Handling**: Using "try" and "except" blocks to handle user input and prevent program crashes, and the "pass" keyword to create empty functions without causing errors.</w:t>
+        <w:t>5. **Control Structures**: If-else statements, loops, and while loops are used to control the flow of a program.</w:t>
+        <w:br/>
+        <w:t>6. **Objects and Classes**: Objects and classes are used to organize and reuse code.</w:t>
+        <w:br/>
+        <w:t>7. **APIs**: APIs can be used to incorporate other people's code and methods into one's own program.</w:t>
         <w:br/>
         <w:br/>
-        <w:t>## Examples</w:t>
+        <w:t>### Examples</w:t>
         <w:br/>
         <w:br/>
-        <w:t>* **Variables**: Creating variables, assigning string values, and printing them, showcasing the difference between variables with the same name but different cases.</w:t>
+        <w:t>1. **Storing Data**: `int x = 5;` stores the integer value 5 in the variable x.</w:t>
         <w:br/>
-        <w:t>* **Loops**: Using "for i in range of three" to loop over three values and print "hello" followed by the value of i.</w:t>
+        <w:t>2. **Using Methods**: `String name = "Susan";` stores the string "Susan" in the variable name, and `name.toUpperCase()` converts the string to uppercase.</w:t>
         <w:br/>
-        <w:t>* **Functions**: Creating a function that prints a greeting to the user and demonstrating how it can be reused with different names.</w:t>
+        <w:t>3. **Control Structures**: `if (x &gt; 5) { System.out.println("x is greater than 5"); }` prints "x is greater than 5" if the condition is true.</w:t>
         <w:br/>
-        <w:t>* **Error Handling**: Using a "try" and "except" block to handle user input, such as asking the user to provide a number and catching the error if the input is not a valid number.</w:t>
+        <w:t>4. **Loops**: `for (int i = 0; i &lt; 5; i++) { System.out.println(i); }` prints the numbers 0 to 4.</w:t>
         <w:br/>
         <w:br/>
-        <w:t>## Interview Questions</w:t>
+        <w:t>### Interview Questions</w:t>
         <w:br/>
         <w:br/>
-        <w:t>1. What are the basic data types in Python, and how do you convert between them?</w:t>
+        <w:t>1. What is the purpose of a programming environment in Java programming?</w:t>
         <w:br/>
-        <w:t>2. How do you create a for loop in Python, and what is the purpose of the "range" function?</w:t>
+        <w:t>2. How do you store data in Java using variables?</w:t>
         <w:br/>
-        <w:t>3. What is the difference between a for loop and a while loop, and when would you use each?</w:t>
+        <w:t>3. What is the difference between primitive and non-primitive types in Java?</w:t>
         <w:br/>
-        <w:t>4. How do you create a function in Python, and what are the benefits of using functions?</w:t>
+        <w:t>4. How do you use methods in Java to perform tasks?</w:t>
         <w:br/>
-        <w:t>5. What is error handling, and how do you use "try" and "except" blocks to handle user input in Python?</w:t>
+        <w:t>5. What are control structures, and how are they used in Java programming?</w:t>
         <w:br/>
         <w:br/>
-        <w:t>## Summary</w:t>
+        <w:t>### Summary</w:t>
         <w:br/>
         <w:br/>
-        <w:t>This study guide provides a comprehensive introduction to the basics of Python programming, covering key concepts such as data types, variables, loops, functions, and error handling. By understanding these concepts and practicing with examples, beginners can gain a solid foundation in Python programming and move on to more advanced topics. The guide also includes interview questions to help reinforce learning and prepare for real-world applications.</w:t>
+        <w:t>In conclusion, this study guide has covered the basics of Java programming, including data storage, object-oriented programming concepts, control structures, methods, and APIs. By following these key concepts and important points, you can gain a solid foundation in Java programming and start building your own Java programs. Remember to practice writing code and experimenting with different concepts to become proficient in Java programming. With dedication and practice, you can become a skilled Java programmer and start building your own projects and applications.</w:t>
       </w:r>
     </w:p>
     <w:sectPr>

</xml_diff>